<commit_message>
CS1103 Unit 2: add real Scanner input validation + .md write-up
- Main now reads a menu choice with Scanner and validates it via
  readIntInRange (rejects non-numeric 'abc' and out-of-range '9',
  accepts '4') - satisfies rubric 'validate user inputs for correct
  data type and range' with actual user input, not just constructor checks
- Add Unit2_Programming_Assignment.md write-up (was docx-only before)
- Regenerate docx: updated output (cart total 92.49) + validation demo
- Recompiled clean with -Xlint:all, re-verified run
</commit_message>
<xml_diff>
--- a/CS1103_Programming_2/Unit2_Packages/Assignment/Unit2_Programming_Assignment.docx
+++ b/CS1103_Programming_2/Unit2_Packages/Assignment/Unit2_Programming_Assignment.docx
@@ -5210,6 +5210,45 @@
           <w:rFonts w:ascii="Courier New" w:hAnsi="Courier New"/>
           <w:sz w:val="18"/>
         </w:rPr>
+        <w:t>import com.ecommerce.Customer;</w:t>
+      </w:r>
+    </w:p>
+    <w:p>
+      <w:pPr>
+        <w:spacing w:line="240" w:lineRule="auto" w:after="0"/>
+        <w:ind w:left="288"/>
+      </w:pPr>
+      <w:r>
+        <w:rPr>
+          <w:rFonts w:ascii="Courier New" w:hAnsi="Courier New"/>
+          <w:sz w:val="18"/>
+        </w:rPr>
+        <w:t>import com.ecommerce.Product;</w:t>
+      </w:r>
+    </w:p>
+    <w:p>
+      <w:pPr>
+        <w:spacing w:line="240" w:lineRule="auto" w:after="0"/>
+        <w:ind w:left="288"/>
+      </w:pPr>
+      <w:r>
+        <w:rPr>
+          <w:rFonts w:ascii="Courier New" w:hAnsi="Courier New"/>
+          <w:sz w:val="18"/>
+        </w:rPr>
+        <w:t>import com.ecommerce.orders.Order;</w:t>
+      </w:r>
+    </w:p>
+    <w:p>
+      <w:pPr>
+        <w:spacing w:line="240" w:lineRule="auto" w:after="0"/>
+        <w:ind w:left="288"/>
+      </w:pPr>
+      <w:r>
+        <w:rPr>
+          <w:rFonts w:ascii="Courier New" w:hAnsi="Courier New"/>
+          <w:sz w:val="18"/>
+        </w:rPr>
         <w:t>import java.util.ArrayList;</w:t>
       </w:r>
     </w:p>
@@ -5223,6 +5262,19 @@
           <w:rFonts w:ascii="Courier New" w:hAnsi="Courier New"/>
           <w:sz w:val="18"/>
         </w:rPr>
+        <w:t>import java.util.InputMismatchException;</w:t>
+      </w:r>
+    </w:p>
+    <w:p>
+      <w:pPr>
+        <w:spacing w:line="240" w:lineRule="auto" w:after="0"/>
+        <w:ind w:left="288"/>
+      </w:pPr>
+      <w:r>
+        <w:rPr>
+          <w:rFonts w:ascii="Courier New" w:hAnsi="Courier New"/>
+          <w:sz w:val="18"/>
+        </w:rPr>
         <w:t>import java.util.List;</w:t>
       </w:r>
     </w:p>
@@ -5236,45 +5288,7 @@
           <w:rFonts w:ascii="Courier New" w:hAnsi="Courier New"/>
           <w:sz w:val="18"/>
         </w:rPr>
-      </w:r>
-    </w:p>
-    <w:p>
-      <w:pPr>
-        <w:spacing w:line="240" w:lineRule="auto" w:after="0"/>
-        <w:ind w:left="288"/>
-      </w:pPr>
-      <w:r>
-        <w:rPr>
-          <w:rFonts w:ascii="Courier New" w:hAnsi="Courier New"/>
-          <w:sz w:val="18"/>
-        </w:rPr>
-        <w:t>import com.ecommerce.Customer;</w:t>
-      </w:r>
-    </w:p>
-    <w:p>
-      <w:pPr>
-        <w:spacing w:line="240" w:lineRule="auto" w:after="0"/>
-        <w:ind w:left="288"/>
-      </w:pPr>
-      <w:r>
-        <w:rPr>
-          <w:rFonts w:ascii="Courier New" w:hAnsi="Courier New"/>
-          <w:sz w:val="18"/>
-        </w:rPr>
-        <w:t>import com.ecommerce.Product;</w:t>
-      </w:r>
-    </w:p>
-    <w:p>
-      <w:pPr>
-        <w:spacing w:line="240" w:lineRule="auto" w:after="0"/>
-        <w:ind w:left="288"/>
-      </w:pPr>
-      <w:r>
-        <w:rPr>
-          <w:rFonts w:ascii="Courier New" w:hAnsi="Courier New"/>
-          <w:sz w:val="18"/>
-        </w:rPr>
-        <w:t>import com.ecommerce.orders.Order;</w:t>
+        <w:t>import java.util.Scanner;</w:t>
       </w:r>
     </w:p>
     <w:p>
@@ -5390,33 +5404,46 @@
           <w:rFonts w:ascii="Courier New" w:hAnsi="Courier New"/>
           <w:sz w:val="18"/>
         </w:rPr>
-        <w:t xml:space="preserve"> * removing an item, and placing an order, then prints the results. Order</w:t>
-      </w:r>
-    </w:p>
-    <w:p>
-      <w:pPr>
-        <w:spacing w:line="240" w:lineRule="auto" w:after="0"/>
-        <w:ind w:left="288"/>
-      </w:pPr>
-      <w:r>
-        <w:rPr>
-          <w:rFonts w:ascii="Courier New" w:hAnsi="Courier New"/>
-          <w:sz w:val="18"/>
-        </w:rPr>
-        <w:t xml:space="preserve"> * placement is wrapped in try/catch so invalid operations are reported</w:t>
-      </w:r>
-    </w:p>
-    <w:p>
-      <w:pPr>
-        <w:spacing w:line="240" w:lineRule="auto" w:after="0"/>
-        <w:ind w:left="288"/>
-      </w:pPr>
-      <w:r>
-        <w:rPr>
-          <w:rFonts w:ascii="Courier New" w:hAnsi="Courier New"/>
-          <w:sz w:val="18"/>
-        </w:rPr>
-        <w:t xml:space="preserve"> * gracefully rather than crashing the program.&lt;/p&gt;</w:t>
+        <w:t xml:space="preserve"> * removing an item, reading and validating a quantity typed by the user, and</w:t>
+      </w:r>
+    </w:p>
+    <w:p>
+      <w:pPr>
+        <w:spacing w:line="240" w:lineRule="auto" w:after="0"/>
+        <w:ind w:left="288"/>
+      </w:pPr>
+      <w:r>
+        <w:rPr>
+          <w:rFonts w:ascii="Courier New" w:hAnsi="Courier New"/>
+          <w:sz w:val="18"/>
+        </w:rPr>
+        <w:t xml:space="preserve"> * placing an order, then prints the results. User input is validated with a</w:t>
+      </w:r>
+    </w:p>
+    <w:p>
+      <w:pPr>
+        <w:spacing w:line="240" w:lineRule="auto" w:after="0"/>
+        <w:ind w:left="288"/>
+      </w:pPr>
+      <w:r>
+        <w:rPr>
+          <w:rFonts w:ascii="Courier New" w:hAnsi="Courier New"/>
+          <w:sz w:val="18"/>
+        </w:rPr>
+        <w:t xml:space="preserve"> * Scanner, and order placement is wrapped in try/catch so invalid operations</w:t>
+      </w:r>
+    </w:p>
+    <w:p>
+      <w:pPr>
+        <w:spacing w:line="240" w:lineRule="auto" w:after="0"/>
+        <w:ind w:left="288"/>
+      </w:pPr>
+      <w:r>
+        <w:rPr>
+          <w:rFonts w:ascii="Courier New" w:hAnsi="Courier New"/>
+          <w:sz w:val="18"/>
+        </w:rPr>
+        <w:t xml:space="preserve"> * are reported gracefully rather than crashing the program.&lt;/p&gt;</w:t>
       </w:r>
     </w:p>
     <w:p>
@@ -5506,6 +5533,382 @@
           <w:rFonts w:ascii="Courier New" w:hAnsi="Courier New"/>
           <w:sz w:val="18"/>
         </w:rPr>
+        <w:t xml:space="preserve">     * Reads a whole number from the user and validates that it is an integer</w:t>
+      </w:r>
+    </w:p>
+    <w:p>
+      <w:pPr>
+        <w:spacing w:line="240" w:lineRule="auto" w:after="0"/>
+        <w:ind w:left="288"/>
+      </w:pPr>
+      <w:r>
+        <w:rPr>
+          <w:rFonts w:ascii="Courier New" w:hAnsi="Courier New"/>
+          <w:sz w:val="18"/>
+        </w:rPr>
+        <w:t xml:space="preserve">     * within the inclusive range [min, max]. The prompt repeats until valid.</w:t>
+      </w:r>
+    </w:p>
+    <w:p>
+      <w:pPr>
+        <w:spacing w:line="240" w:lineRule="auto" w:after="0"/>
+        <w:ind w:left="288"/>
+      </w:pPr>
+      <w:r>
+        <w:rPr>
+          <w:rFonts w:ascii="Courier New" w:hAnsi="Courier New"/>
+          <w:sz w:val="18"/>
+        </w:rPr>
+        <w:t xml:space="preserve">     *</w:t>
+      </w:r>
+    </w:p>
+    <w:p>
+      <w:pPr>
+        <w:spacing w:line="240" w:lineRule="auto" w:after="0"/>
+        <w:ind w:left="288"/>
+      </w:pPr>
+      <w:r>
+        <w:rPr>
+          <w:rFonts w:ascii="Courier New" w:hAnsi="Courier New"/>
+          <w:sz w:val="18"/>
+        </w:rPr>
+        <w:t xml:space="preserve">     * @param scanner the Scanner used to read input</w:t>
+      </w:r>
+    </w:p>
+    <w:p>
+      <w:pPr>
+        <w:spacing w:line="240" w:lineRule="auto" w:after="0"/>
+        <w:ind w:left="288"/>
+      </w:pPr>
+      <w:r>
+        <w:rPr>
+          <w:rFonts w:ascii="Courier New" w:hAnsi="Courier New"/>
+          <w:sz w:val="18"/>
+        </w:rPr>
+        <w:t xml:space="preserve">     * @param prompt  the message shown to the user</w:t>
+      </w:r>
+    </w:p>
+    <w:p>
+      <w:pPr>
+        <w:spacing w:line="240" w:lineRule="auto" w:after="0"/>
+        <w:ind w:left="288"/>
+      </w:pPr>
+      <w:r>
+        <w:rPr>
+          <w:rFonts w:ascii="Courier New" w:hAnsi="Courier New"/>
+          <w:sz w:val="18"/>
+        </w:rPr>
+        <w:t xml:space="preserve">     * @param min     the smallest acceptable value</w:t>
+      </w:r>
+    </w:p>
+    <w:p>
+      <w:pPr>
+        <w:spacing w:line="240" w:lineRule="auto" w:after="0"/>
+        <w:ind w:left="288"/>
+      </w:pPr>
+      <w:r>
+        <w:rPr>
+          <w:rFonts w:ascii="Courier New" w:hAnsi="Courier New"/>
+          <w:sz w:val="18"/>
+        </w:rPr>
+        <w:t xml:space="preserve">     * @param max     the largest acceptable value</w:t>
+      </w:r>
+    </w:p>
+    <w:p>
+      <w:pPr>
+        <w:spacing w:line="240" w:lineRule="auto" w:after="0"/>
+        <w:ind w:left="288"/>
+      </w:pPr>
+      <w:r>
+        <w:rPr>
+          <w:rFonts w:ascii="Courier New" w:hAnsi="Courier New"/>
+          <w:sz w:val="18"/>
+        </w:rPr>
+        <w:t xml:space="preserve">     * @return a validated integer within the range</w:t>
+      </w:r>
+    </w:p>
+    <w:p>
+      <w:pPr>
+        <w:spacing w:line="240" w:lineRule="auto" w:after="0"/>
+        <w:ind w:left="288"/>
+      </w:pPr>
+      <w:r>
+        <w:rPr>
+          <w:rFonts w:ascii="Courier New" w:hAnsi="Courier New"/>
+          <w:sz w:val="18"/>
+        </w:rPr>
+        <w:t xml:space="preserve">     */</w:t>
+      </w:r>
+    </w:p>
+    <w:p>
+      <w:pPr>
+        <w:spacing w:line="240" w:lineRule="auto" w:after="0"/>
+        <w:ind w:left="288"/>
+      </w:pPr>
+      <w:r>
+        <w:rPr>
+          <w:rFonts w:ascii="Courier New" w:hAnsi="Courier New"/>
+          <w:sz w:val="18"/>
+        </w:rPr>
+        <w:t xml:space="preserve">    private static int readIntInRange(Scanner scanner, String prompt, int min,</w:t>
+      </w:r>
+    </w:p>
+    <w:p>
+      <w:pPr>
+        <w:spacing w:line="240" w:lineRule="auto" w:after="0"/>
+        <w:ind w:left="288"/>
+      </w:pPr>
+      <w:r>
+        <w:rPr>
+          <w:rFonts w:ascii="Courier New" w:hAnsi="Courier New"/>
+          <w:sz w:val="18"/>
+        </w:rPr>
+        <w:t xml:space="preserve">            int max) {</w:t>
+      </w:r>
+    </w:p>
+    <w:p>
+      <w:pPr>
+        <w:spacing w:line="240" w:lineRule="auto" w:after="0"/>
+        <w:ind w:left="288"/>
+      </w:pPr>
+      <w:r>
+        <w:rPr>
+          <w:rFonts w:ascii="Courier New" w:hAnsi="Courier New"/>
+          <w:sz w:val="18"/>
+        </w:rPr>
+        <w:t xml:space="preserve">        while (true) {</w:t>
+      </w:r>
+    </w:p>
+    <w:p>
+      <w:pPr>
+        <w:spacing w:line="240" w:lineRule="auto" w:after="0"/>
+        <w:ind w:left="288"/>
+      </w:pPr>
+      <w:r>
+        <w:rPr>
+          <w:rFonts w:ascii="Courier New" w:hAnsi="Courier New"/>
+          <w:sz w:val="18"/>
+        </w:rPr>
+        <w:t xml:space="preserve">            System.out.print(prompt);</w:t>
+      </w:r>
+    </w:p>
+    <w:p>
+      <w:pPr>
+        <w:spacing w:line="240" w:lineRule="auto" w:after="0"/>
+        <w:ind w:left="288"/>
+      </w:pPr>
+      <w:r>
+        <w:rPr>
+          <w:rFonts w:ascii="Courier New" w:hAnsi="Courier New"/>
+          <w:sz w:val="18"/>
+        </w:rPr>
+        <w:t xml:space="preserve">            try {</w:t>
+      </w:r>
+    </w:p>
+    <w:p>
+      <w:pPr>
+        <w:spacing w:line="240" w:lineRule="auto" w:after="0"/>
+        <w:ind w:left="288"/>
+      </w:pPr>
+      <w:r>
+        <w:rPr>
+          <w:rFonts w:ascii="Courier New" w:hAnsi="Courier New"/>
+          <w:sz w:val="18"/>
+        </w:rPr>
+        <w:t xml:space="preserve">                int value = scanner.nextInt();</w:t>
+      </w:r>
+    </w:p>
+    <w:p>
+      <w:pPr>
+        <w:spacing w:line="240" w:lineRule="auto" w:after="0"/>
+        <w:ind w:left="288"/>
+      </w:pPr>
+      <w:r>
+        <w:rPr>
+          <w:rFonts w:ascii="Courier New" w:hAnsi="Courier New"/>
+          <w:sz w:val="18"/>
+        </w:rPr>
+        <w:t xml:space="preserve">                if (value &lt; min || value &gt; max) {</w:t>
+      </w:r>
+    </w:p>
+    <w:p>
+      <w:pPr>
+        <w:spacing w:line="240" w:lineRule="auto" w:after="0"/>
+        <w:ind w:left="288"/>
+      </w:pPr>
+      <w:r>
+        <w:rPr>
+          <w:rFonts w:ascii="Courier New" w:hAnsi="Courier New"/>
+          <w:sz w:val="18"/>
+        </w:rPr>
+        <w:t xml:space="preserve">                    System.out.println("Please enter a number between " + min</w:t>
+      </w:r>
+    </w:p>
+    <w:p>
+      <w:pPr>
+        <w:spacing w:line="240" w:lineRule="auto" w:after="0"/>
+        <w:ind w:left="288"/>
+      </w:pPr>
+      <w:r>
+        <w:rPr>
+          <w:rFonts w:ascii="Courier New" w:hAnsi="Courier New"/>
+          <w:sz w:val="18"/>
+        </w:rPr>
+        <w:t xml:space="preserve">                            + " and " + max + ".");</w:t>
+      </w:r>
+    </w:p>
+    <w:p>
+      <w:pPr>
+        <w:spacing w:line="240" w:lineRule="auto" w:after="0"/>
+        <w:ind w:left="288"/>
+      </w:pPr>
+      <w:r>
+        <w:rPr>
+          <w:rFonts w:ascii="Courier New" w:hAnsi="Courier New"/>
+          <w:sz w:val="18"/>
+        </w:rPr>
+        <w:t xml:space="preserve">                } else {</w:t>
+      </w:r>
+    </w:p>
+    <w:p>
+      <w:pPr>
+        <w:spacing w:line="240" w:lineRule="auto" w:after="0"/>
+        <w:ind w:left="288"/>
+      </w:pPr>
+      <w:r>
+        <w:rPr>
+          <w:rFonts w:ascii="Courier New" w:hAnsi="Courier New"/>
+          <w:sz w:val="18"/>
+        </w:rPr>
+        <w:t xml:space="preserve">                    return value;</w:t>
+      </w:r>
+    </w:p>
+    <w:p>
+      <w:pPr>
+        <w:spacing w:line="240" w:lineRule="auto" w:after="0"/>
+        <w:ind w:left="288"/>
+      </w:pPr>
+      <w:r>
+        <w:rPr>
+          <w:rFonts w:ascii="Courier New" w:hAnsi="Courier New"/>
+          <w:sz w:val="18"/>
+        </w:rPr>
+        <w:t xml:space="preserve">                }</w:t>
+      </w:r>
+    </w:p>
+    <w:p>
+      <w:pPr>
+        <w:spacing w:line="240" w:lineRule="auto" w:after="0"/>
+        <w:ind w:left="288"/>
+      </w:pPr>
+      <w:r>
+        <w:rPr>
+          <w:rFonts w:ascii="Courier New" w:hAnsi="Courier New"/>
+          <w:sz w:val="18"/>
+        </w:rPr>
+        <w:t xml:space="preserve">            } catch (InputMismatchException e) {</w:t>
+      </w:r>
+    </w:p>
+    <w:p>
+      <w:pPr>
+        <w:spacing w:line="240" w:lineRule="auto" w:after="0"/>
+        <w:ind w:left="288"/>
+      </w:pPr>
+      <w:r>
+        <w:rPr>
+          <w:rFonts w:ascii="Courier New" w:hAnsi="Courier New"/>
+          <w:sz w:val="18"/>
+        </w:rPr>
+        <w:t xml:space="preserve">                System.out.println("Invalid input: please enter a whole number.");</w:t>
+      </w:r>
+    </w:p>
+    <w:p>
+      <w:pPr>
+        <w:spacing w:line="240" w:lineRule="auto" w:after="0"/>
+        <w:ind w:left="288"/>
+      </w:pPr>
+      <w:r>
+        <w:rPr>
+          <w:rFonts w:ascii="Courier New" w:hAnsi="Courier New"/>
+          <w:sz w:val="18"/>
+        </w:rPr>
+        <w:t xml:space="preserve">                scanner.next();   // discard the invalid token</w:t>
+      </w:r>
+    </w:p>
+    <w:p>
+      <w:pPr>
+        <w:spacing w:line="240" w:lineRule="auto" w:after="0"/>
+        <w:ind w:left="288"/>
+      </w:pPr>
+      <w:r>
+        <w:rPr>
+          <w:rFonts w:ascii="Courier New" w:hAnsi="Courier New"/>
+          <w:sz w:val="18"/>
+        </w:rPr>
+        <w:t xml:space="preserve">            }</w:t>
+      </w:r>
+    </w:p>
+    <w:p>
+      <w:pPr>
+        <w:spacing w:line="240" w:lineRule="auto" w:after="0"/>
+        <w:ind w:left="288"/>
+      </w:pPr>
+      <w:r>
+        <w:rPr>
+          <w:rFonts w:ascii="Courier New" w:hAnsi="Courier New"/>
+          <w:sz w:val="18"/>
+        </w:rPr>
+        <w:t xml:space="preserve">        }</w:t>
+      </w:r>
+    </w:p>
+    <w:p>
+      <w:pPr>
+        <w:spacing w:line="240" w:lineRule="auto" w:after="0"/>
+        <w:ind w:left="288"/>
+      </w:pPr>
+      <w:r>
+        <w:rPr>
+          <w:rFonts w:ascii="Courier New" w:hAnsi="Courier New"/>
+          <w:sz w:val="18"/>
+        </w:rPr>
+        <w:t xml:space="preserve">    }</w:t>
+      </w:r>
+    </w:p>
+    <w:p>
+      <w:pPr>
+        <w:spacing w:line="240" w:lineRule="auto" w:after="0"/>
+        <w:ind w:left="288"/>
+      </w:pPr>
+      <w:r>
+        <w:rPr>
+          <w:rFonts w:ascii="Courier New" w:hAnsi="Courier New"/>
+          <w:sz w:val="18"/>
+        </w:rPr>
+      </w:r>
+    </w:p>
+    <w:p>
+      <w:pPr>
+        <w:spacing w:line="240" w:lineRule="auto" w:after="0"/>
+        <w:ind w:left="288"/>
+      </w:pPr>
+      <w:r>
+        <w:rPr>
+          <w:rFonts w:ascii="Courier New" w:hAnsi="Courier New"/>
+          <w:sz w:val="18"/>
+        </w:rPr>
+        <w:t xml:space="preserve">    /**</w:t>
+      </w:r>
+    </w:p>
+    <w:p>
+      <w:pPr>
+        <w:spacing w:line="240" w:lineRule="auto" w:after="0"/>
+        <w:ind w:left="288"/>
+      </w:pPr>
+      <w:r>
+        <w:rPr>
+          <w:rFonts w:ascii="Courier New" w:hAnsi="Courier New"/>
+          <w:sz w:val="18"/>
+        </w:rPr>
         <w:t xml:space="preserve">     * Program entry point.</w:t>
       </w:r>
     </w:p>
@@ -5571,6 +5974,19 @@
           <w:rFonts w:ascii="Courier New" w:hAnsi="Courier New"/>
           <w:sz w:val="18"/>
         </w:rPr>
+        <w:t xml:space="preserve">        Scanner scanner = new Scanner(System.in);</w:t>
+      </w:r>
+    </w:p>
+    <w:p>
+      <w:pPr>
+        <w:spacing w:line="240" w:lineRule="auto" w:after="0"/>
+        <w:ind w:left="288"/>
+      </w:pPr>
+      <w:r>
+        <w:rPr>
+          <w:rFonts w:ascii="Courier New" w:hAnsi="Courier New"/>
+          <w:sz w:val="18"/>
+        </w:rPr>
         <w:t xml:space="preserve">        System.out.println("===== Welcome to the Online Store =====\n");</w:t>
       </w:r>
     </w:p>
@@ -5712,7 +6128,340 @@
           <w:rFonts w:ascii="Courier New" w:hAnsi="Courier New"/>
           <w:sz w:val="18"/>
         </w:rPr>
-        <w:t xml:space="preserve">        for (Product product : catalog) {</w:t>
+        <w:t xml:space="preserve">        for (int i = 0; i &lt; catalog.size(); i++) {</w:t>
+      </w:r>
+    </w:p>
+    <w:p>
+      <w:pPr>
+        <w:spacing w:line="240" w:lineRule="auto" w:after="0"/>
+        <w:ind w:left="288"/>
+      </w:pPr>
+      <w:r>
+        <w:rPr>
+          <w:rFonts w:ascii="Courier New" w:hAnsi="Courier New"/>
+          <w:sz w:val="18"/>
+        </w:rPr>
+        <w:t xml:space="preserve">            System.out.println("  " + (i + 1) + ". " + catalog.get(i));</w:t>
+      </w:r>
+    </w:p>
+    <w:p>
+      <w:pPr>
+        <w:spacing w:line="240" w:lineRule="auto" w:after="0"/>
+        <w:ind w:left="288"/>
+      </w:pPr>
+      <w:r>
+        <w:rPr>
+          <w:rFonts w:ascii="Courier New" w:hAnsi="Courier New"/>
+          <w:sz w:val="18"/>
+        </w:rPr>
+        <w:t xml:space="preserve">        }</w:t>
+      </w:r>
+    </w:p>
+    <w:p>
+      <w:pPr>
+        <w:spacing w:line="240" w:lineRule="auto" w:after="0"/>
+        <w:ind w:left="288"/>
+      </w:pPr>
+      <w:r>
+        <w:rPr>
+          <w:rFonts w:ascii="Courier New" w:hAnsi="Courier New"/>
+          <w:sz w:val="18"/>
+        </w:rPr>
+        <w:t xml:space="preserve">        System.out.println();</w:t>
+      </w:r>
+    </w:p>
+    <w:p>
+      <w:pPr>
+        <w:spacing w:line="240" w:lineRule="auto" w:after="0"/>
+        <w:ind w:left="288"/>
+      </w:pPr>
+      <w:r>
+        <w:rPr>
+          <w:rFonts w:ascii="Courier New" w:hAnsi="Courier New"/>
+          <w:sz w:val="18"/>
+        </w:rPr>
+      </w:r>
+    </w:p>
+    <w:p>
+      <w:pPr>
+        <w:spacing w:line="240" w:lineRule="auto" w:after="0"/>
+        <w:ind w:left="288"/>
+      </w:pPr>
+      <w:r>
+        <w:rPr>
+          <w:rFonts w:ascii="Courier New" w:hAnsi="Courier New"/>
+          <w:sz w:val="18"/>
+        </w:rPr>
+        <w:t xml:space="preserve">        // 3. Create a customer and add products to the shopping cart.</w:t>
+      </w:r>
+    </w:p>
+    <w:p>
+      <w:pPr>
+        <w:spacing w:line="240" w:lineRule="auto" w:after="0"/>
+        <w:ind w:left="288"/>
+      </w:pPr>
+      <w:r>
+        <w:rPr>
+          <w:rFonts w:ascii="Courier New" w:hAnsi="Courier New"/>
+          <w:sz w:val="18"/>
+        </w:rPr>
+        <w:t xml:space="preserve">        Customer customer = new Customer(1, "Nicanor");</w:t>
+      </w:r>
+    </w:p>
+    <w:p>
+      <w:pPr>
+        <w:spacing w:line="240" w:lineRule="auto" w:after="0"/>
+        <w:ind w:left="288"/>
+      </w:pPr>
+      <w:r>
+        <w:rPr>
+          <w:rFonts w:ascii="Courier New" w:hAnsi="Courier New"/>
+          <w:sz w:val="18"/>
+        </w:rPr>
+        <w:t xml:space="preserve">        System.out.println(customer + "\n");</w:t>
+      </w:r>
+    </w:p>
+    <w:p>
+      <w:pPr>
+        <w:spacing w:line="240" w:lineRule="auto" w:after="0"/>
+        <w:ind w:left="288"/>
+      </w:pPr>
+      <w:r>
+        <w:rPr>
+          <w:rFonts w:ascii="Courier New" w:hAnsi="Courier New"/>
+          <w:sz w:val="18"/>
+        </w:rPr>
+      </w:r>
+    </w:p>
+    <w:p>
+      <w:pPr>
+        <w:spacing w:line="240" w:lineRule="auto" w:after="0"/>
+        <w:ind w:left="288"/>
+      </w:pPr>
+      <w:r>
+        <w:rPr>
+          <w:rFonts w:ascii="Courier New" w:hAnsi="Courier New"/>
+          <w:sz w:val="18"/>
+        </w:rPr>
+        <w:t xml:space="preserve">        customer.addProduct(catalog.get(0));   // Wireless Mouse</w:t>
+      </w:r>
+    </w:p>
+    <w:p>
+      <w:pPr>
+        <w:spacing w:line="240" w:lineRule="auto" w:after="0"/>
+        <w:ind w:left="288"/>
+      </w:pPr>
+      <w:r>
+        <w:rPr>
+          <w:rFonts w:ascii="Courier New" w:hAnsi="Courier New"/>
+          <w:sz w:val="18"/>
+        </w:rPr>
+        <w:t xml:space="preserve">        customer.addProduct(catalog.get(1));   // Mechanical Keyboard</w:t>
+      </w:r>
+    </w:p>
+    <w:p>
+      <w:pPr>
+        <w:spacing w:line="240" w:lineRule="auto" w:after="0"/>
+        <w:ind w:left="288"/>
+      </w:pPr>
+      <w:r>
+        <w:rPr>
+          <w:rFonts w:ascii="Courier New" w:hAnsi="Courier New"/>
+          <w:sz w:val="18"/>
+        </w:rPr>
+        <w:t xml:space="preserve">        customer.addProduct(catalog.get(2));   // USB-C Cable</w:t>
+      </w:r>
+    </w:p>
+    <w:p>
+      <w:pPr>
+        <w:spacing w:line="240" w:lineRule="auto" w:after="0"/>
+        <w:ind w:left="288"/>
+      </w:pPr>
+      <w:r>
+        <w:rPr>
+          <w:rFonts w:ascii="Courier New" w:hAnsi="Courier New"/>
+          <w:sz w:val="18"/>
+        </w:rPr>
+      </w:r>
+    </w:p>
+    <w:p>
+      <w:pPr>
+        <w:spacing w:line="240" w:lineRule="auto" w:after="0"/>
+        <w:ind w:left="288"/>
+      </w:pPr>
+      <w:r>
+        <w:rPr>
+          <w:rFonts w:ascii="Courier New" w:hAnsi="Courier New"/>
+          <w:sz w:val="18"/>
+        </w:rPr>
+        <w:t xml:space="preserve">        // 4. Remove one product to show cart management.</w:t>
+      </w:r>
+    </w:p>
+    <w:p>
+      <w:pPr>
+        <w:spacing w:line="240" w:lineRule="auto" w:after="0"/>
+        <w:ind w:left="288"/>
+      </w:pPr>
+      <w:r>
+        <w:rPr>
+          <w:rFonts w:ascii="Courier New" w:hAnsi="Courier New"/>
+          <w:sz w:val="18"/>
+        </w:rPr>
+        <w:t xml:space="preserve">        customer.removeProduct(catalog.get(2));   // remove USB-C Cable</w:t>
+      </w:r>
+    </w:p>
+    <w:p>
+      <w:pPr>
+        <w:spacing w:line="240" w:lineRule="auto" w:after="0"/>
+        <w:ind w:left="288"/>
+      </w:pPr>
+      <w:r>
+        <w:rPr>
+          <w:rFonts w:ascii="Courier New" w:hAnsi="Courier New"/>
+          <w:sz w:val="18"/>
+        </w:rPr>
+        <w:t xml:space="preserve">        System.out.println();</w:t>
+      </w:r>
+    </w:p>
+    <w:p>
+      <w:pPr>
+        <w:spacing w:line="240" w:lineRule="auto" w:after="0"/>
+        <w:ind w:left="288"/>
+      </w:pPr>
+      <w:r>
+        <w:rPr>
+          <w:rFonts w:ascii="Courier New" w:hAnsi="Courier New"/>
+          <w:sz w:val="18"/>
+        </w:rPr>
+      </w:r>
+    </w:p>
+    <w:p>
+      <w:pPr>
+        <w:spacing w:line="240" w:lineRule="auto" w:after="0"/>
+        <w:ind w:left="288"/>
+      </w:pPr>
+      <w:r>
+        <w:rPr>
+          <w:rFonts w:ascii="Courier New" w:hAnsi="Courier New"/>
+          <w:sz w:val="18"/>
+        </w:rPr>
+        <w:t xml:space="preserve">        // 5. Read and validate a user choice: add one more item by menu number.</w:t>
+      </w:r>
+    </w:p>
+    <w:p>
+      <w:pPr>
+        <w:spacing w:line="240" w:lineRule="auto" w:after="0"/>
+        <w:ind w:left="288"/>
+      </w:pPr>
+      <w:r>
+        <w:rPr>
+          <w:rFonts w:ascii="Courier New" w:hAnsi="Courier New"/>
+          <w:sz w:val="18"/>
+        </w:rPr>
+        <w:t xml:space="preserve">        int choice = readIntInRange(scanner,</w:t>
+      </w:r>
+    </w:p>
+    <w:p>
+      <w:pPr>
+        <w:spacing w:line="240" w:lineRule="auto" w:after="0"/>
+        <w:ind w:left="288"/>
+      </w:pPr>
+      <w:r>
+        <w:rPr>
+          <w:rFonts w:ascii="Courier New" w:hAnsi="Courier New"/>
+          <w:sz w:val="18"/>
+        </w:rPr>
+        <w:t xml:space="preserve">                "Enter the number (1-" + catalog.size()</w:t>
+      </w:r>
+    </w:p>
+    <w:p>
+      <w:pPr>
+        <w:spacing w:line="240" w:lineRule="auto" w:after="0"/>
+        <w:ind w:left="288"/>
+      </w:pPr>
+      <w:r>
+        <w:rPr>
+          <w:rFonts w:ascii="Courier New" w:hAnsi="Courier New"/>
+          <w:sz w:val="18"/>
+        </w:rPr>
+        <w:t xml:space="preserve">                + ") of another product to add: ", 1, catalog.size());</w:t>
+      </w:r>
+    </w:p>
+    <w:p>
+      <w:pPr>
+        <w:spacing w:line="240" w:lineRule="auto" w:after="0"/>
+        <w:ind w:left="288"/>
+      </w:pPr>
+      <w:r>
+        <w:rPr>
+          <w:rFonts w:ascii="Courier New" w:hAnsi="Courier New"/>
+          <w:sz w:val="18"/>
+        </w:rPr>
+        <w:t xml:space="preserve">        customer.addProduct(catalog.get(choice - 1));</w:t>
+      </w:r>
+    </w:p>
+    <w:p>
+      <w:pPr>
+        <w:spacing w:line="240" w:lineRule="auto" w:after="0"/>
+        <w:ind w:left="288"/>
+      </w:pPr>
+      <w:r>
+        <w:rPr>
+          <w:rFonts w:ascii="Courier New" w:hAnsi="Courier New"/>
+          <w:sz w:val="18"/>
+        </w:rPr>
+        <w:t xml:space="preserve">        System.out.println();</w:t>
+      </w:r>
+    </w:p>
+    <w:p>
+      <w:pPr>
+        <w:spacing w:line="240" w:lineRule="auto" w:after="0"/>
+        <w:ind w:left="288"/>
+      </w:pPr>
+      <w:r>
+        <w:rPr>
+          <w:rFonts w:ascii="Courier New" w:hAnsi="Courier New"/>
+          <w:sz w:val="18"/>
+        </w:rPr>
+      </w:r>
+    </w:p>
+    <w:p>
+      <w:pPr>
+        <w:spacing w:line="240" w:lineRule="auto" w:after="0"/>
+        <w:ind w:left="288"/>
+      </w:pPr>
+      <w:r>
+        <w:rPr>
+          <w:rFonts w:ascii="Courier New" w:hAnsi="Courier New"/>
+          <w:sz w:val="18"/>
+        </w:rPr>
+        <w:t xml:space="preserve">        // 6. Show the current cart and its total.</w:t>
+      </w:r>
+    </w:p>
+    <w:p>
+      <w:pPr>
+        <w:spacing w:line="240" w:lineRule="auto" w:after="0"/>
+        <w:ind w:left="288"/>
+      </w:pPr>
+      <w:r>
+        <w:rPr>
+          <w:rFonts w:ascii="Courier New" w:hAnsi="Courier New"/>
+          <w:sz w:val="18"/>
+        </w:rPr>
+        <w:t xml:space="preserve">        System.out.println("Current cart for " + customer.getName() + ":");</w:t>
+      </w:r>
+    </w:p>
+    <w:p>
+      <w:pPr>
+        <w:spacing w:line="240" w:lineRule="auto" w:after="0"/>
+        <w:ind w:left="288"/>
+      </w:pPr>
+      <w:r>
+        <w:rPr>
+          <w:rFonts w:ascii="Courier New" w:hAnsi="Courier New"/>
+          <w:sz w:val="18"/>
+        </w:rPr>
+        <w:t xml:space="preserve">        for (Product product : customer.getShoppingCart()) {</w:t>
       </w:r>
     </w:p>
     <w:p>
@@ -5751,224 +6500,174 @@
           <w:rFonts w:ascii="Courier New" w:hAnsi="Courier New"/>
           <w:sz w:val="18"/>
         </w:rPr>
-        <w:t xml:space="preserve">        System.out.println();</w:t>
-      </w:r>
-    </w:p>
-    <w:p>
-      <w:pPr>
-        <w:spacing w:line="240" w:lineRule="auto" w:after="0"/>
-        <w:ind w:left="288"/>
-      </w:pPr>
-      <w:r>
-        <w:rPr>
-          <w:rFonts w:ascii="Courier New" w:hAnsi="Courier New"/>
-          <w:sz w:val="18"/>
-        </w:rPr>
-      </w:r>
-    </w:p>
-    <w:p>
-      <w:pPr>
-        <w:spacing w:line="240" w:lineRule="auto" w:after="0"/>
-        <w:ind w:left="288"/>
-      </w:pPr>
-      <w:r>
-        <w:rPr>
-          <w:rFonts w:ascii="Courier New" w:hAnsi="Courier New"/>
-          <w:sz w:val="18"/>
-        </w:rPr>
-        <w:t xml:space="preserve">        // 3. Create a customer and add products to the shopping cart.</w:t>
-      </w:r>
-    </w:p>
-    <w:p>
-      <w:pPr>
-        <w:spacing w:line="240" w:lineRule="auto" w:after="0"/>
-        <w:ind w:left="288"/>
-      </w:pPr>
-      <w:r>
-        <w:rPr>
-          <w:rFonts w:ascii="Courier New" w:hAnsi="Courier New"/>
-          <w:sz w:val="18"/>
-        </w:rPr>
-        <w:t xml:space="preserve">        Customer customer = new Customer(1, "Nicanor");</w:t>
-      </w:r>
-    </w:p>
-    <w:p>
-      <w:pPr>
-        <w:spacing w:line="240" w:lineRule="auto" w:after="0"/>
-        <w:ind w:left="288"/>
-      </w:pPr>
-      <w:r>
-        <w:rPr>
-          <w:rFonts w:ascii="Courier New" w:hAnsi="Courier New"/>
-          <w:sz w:val="18"/>
-        </w:rPr>
-        <w:t xml:space="preserve">        System.out.println(customer + "\n");</w:t>
-      </w:r>
-    </w:p>
-    <w:p>
-      <w:pPr>
-        <w:spacing w:line="240" w:lineRule="auto" w:after="0"/>
-        <w:ind w:left="288"/>
-      </w:pPr>
-      <w:r>
-        <w:rPr>
-          <w:rFonts w:ascii="Courier New" w:hAnsi="Courier New"/>
-          <w:sz w:val="18"/>
-        </w:rPr>
-      </w:r>
-    </w:p>
-    <w:p>
-      <w:pPr>
-        <w:spacing w:line="240" w:lineRule="auto" w:after="0"/>
-        <w:ind w:left="288"/>
-      </w:pPr>
-      <w:r>
-        <w:rPr>
-          <w:rFonts w:ascii="Courier New" w:hAnsi="Courier New"/>
-          <w:sz w:val="18"/>
-        </w:rPr>
-        <w:t xml:space="preserve">        customer.addProduct(catalog.get(0));   // Wireless Mouse</w:t>
-      </w:r>
-    </w:p>
-    <w:p>
-      <w:pPr>
-        <w:spacing w:line="240" w:lineRule="auto" w:after="0"/>
-        <w:ind w:left="288"/>
-      </w:pPr>
-      <w:r>
-        <w:rPr>
-          <w:rFonts w:ascii="Courier New" w:hAnsi="Courier New"/>
-          <w:sz w:val="18"/>
-        </w:rPr>
-        <w:t xml:space="preserve">        customer.addProduct(catalog.get(1));   // Mechanical Keyboard</w:t>
-      </w:r>
-    </w:p>
-    <w:p>
-      <w:pPr>
-        <w:spacing w:line="240" w:lineRule="auto" w:after="0"/>
-        <w:ind w:left="288"/>
-      </w:pPr>
-      <w:r>
-        <w:rPr>
-          <w:rFonts w:ascii="Courier New" w:hAnsi="Courier New"/>
-          <w:sz w:val="18"/>
-        </w:rPr>
-        <w:t xml:space="preserve">        customer.addProduct(catalog.get(2));   // USB-C Cable</w:t>
-      </w:r>
-    </w:p>
-    <w:p>
-      <w:pPr>
-        <w:spacing w:line="240" w:lineRule="auto" w:after="0"/>
-        <w:ind w:left="288"/>
-      </w:pPr>
-      <w:r>
-        <w:rPr>
-          <w:rFonts w:ascii="Courier New" w:hAnsi="Courier New"/>
-          <w:sz w:val="18"/>
-        </w:rPr>
-      </w:r>
-    </w:p>
-    <w:p>
-      <w:pPr>
-        <w:spacing w:line="240" w:lineRule="auto" w:after="0"/>
-        <w:ind w:left="288"/>
-      </w:pPr>
-      <w:r>
-        <w:rPr>
-          <w:rFonts w:ascii="Courier New" w:hAnsi="Courier New"/>
-          <w:sz w:val="18"/>
-        </w:rPr>
-        <w:t xml:space="preserve">        // 4. Remove one product to show cart management.</w:t>
-      </w:r>
-    </w:p>
-    <w:p>
-      <w:pPr>
-        <w:spacing w:line="240" w:lineRule="auto" w:after="0"/>
-        <w:ind w:left="288"/>
-      </w:pPr>
-      <w:r>
-        <w:rPr>
-          <w:rFonts w:ascii="Courier New" w:hAnsi="Courier New"/>
-          <w:sz w:val="18"/>
-        </w:rPr>
-        <w:t xml:space="preserve">        customer.removeProduct(catalog.get(2));   // remove USB-C Cable</w:t>
-      </w:r>
-    </w:p>
-    <w:p>
-      <w:pPr>
-        <w:spacing w:line="240" w:lineRule="auto" w:after="0"/>
-        <w:ind w:left="288"/>
-      </w:pPr>
-      <w:r>
-        <w:rPr>
-          <w:rFonts w:ascii="Courier New" w:hAnsi="Courier New"/>
-          <w:sz w:val="18"/>
-        </w:rPr>
-        <w:t xml:space="preserve">        System.out.println();</w:t>
-      </w:r>
-    </w:p>
-    <w:p>
-      <w:pPr>
-        <w:spacing w:line="240" w:lineRule="auto" w:after="0"/>
-        <w:ind w:left="288"/>
-      </w:pPr>
-      <w:r>
-        <w:rPr>
-          <w:rFonts w:ascii="Courier New" w:hAnsi="Courier New"/>
-          <w:sz w:val="18"/>
-        </w:rPr>
-      </w:r>
-    </w:p>
-    <w:p>
-      <w:pPr>
-        <w:spacing w:line="240" w:lineRule="auto" w:after="0"/>
-        <w:ind w:left="288"/>
-      </w:pPr>
-      <w:r>
-        <w:rPr>
-          <w:rFonts w:ascii="Courier New" w:hAnsi="Courier New"/>
-          <w:sz w:val="18"/>
-        </w:rPr>
-        <w:t xml:space="preserve">        // 5. Show the current cart and its total.</w:t>
-      </w:r>
-    </w:p>
-    <w:p>
-      <w:pPr>
-        <w:spacing w:line="240" w:lineRule="auto" w:after="0"/>
-        <w:ind w:left="288"/>
-      </w:pPr>
-      <w:r>
-        <w:rPr>
-          <w:rFonts w:ascii="Courier New" w:hAnsi="Courier New"/>
-          <w:sz w:val="18"/>
-        </w:rPr>
-        <w:t xml:space="preserve">        System.out.println("Current cart for " + customer.getName() + ":");</w:t>
-      </w:r>
-    </w:p>
-    <w:p>
-      <w:pPr>
-        <w:spacing w:line="240" w:lineRule="auto" w:after="0"/>
-        <w:ind w:left="288"/>
-      </w:pPr>
-      <w:r>
-        <w:rPr>
-          <w:rFonts w:ascii="Courier New" w:hAnsi="Courier New"/>
-          <w:sz w:val="18"/>
-        </w:rPr>
-        <w:t xml:space="preserve">        for (Product product : customer.getShoppingCart()) {</w:t>
-      </w:r>
-    </w:p>
-    <w:p>
-      <w:pPr>
-        <w:spacing w:line="240" w:lineRule="auto" w:after="0"/>
-        <w:ind w:left="288"/>
-      </w:pPr>
-      <w:r>
-        <w:rPr>
-          <w:rFonts w:ascii="Courier New" w:hAnsi="Courier New"/>
-          <w:sz w:val="18"/>
-        </w:rPr>
-        <w:t xml:space="preserve">            System.out.println("  " + product);</w:t>
+        <w:t xml:space="preserve">        System.out.printf("Cart total: $%.2f%n%n", customer.calculateTotal());</w:t>
+      </w:r>
+    </w:p>
+    <w:p>
+      <w:pPr>
+        <w:spacing w:line="240" w:lineRule="auto" w:after="0"/>
+        <w:ind w:left="288"/>
+      </w:pPr>
+      <w:r>
+        <w:rPr>
+          <w:rFonts w:ascii="Courier New" w:hAnsi="Courier New"/>
+          <w:sz w:val="18"/>
+        </w:rPr>
+      </w:r>
+    </w:p>
+    <w:p>
+      <w:pPr>
+        <w:spacing w:line="240" w:lineRule="auto" w:after="0"/>
+        <w:ind w:left="288"/>
+      </w:pPr>
+      <w:r>
+        <w:rPr>
+          <w:rFonts w:ascii="Courier New" w:hAnsi="Courier New"/>
+          <w:sz w:val="18"/>
+        </w:rPr>
+        <w:t xml:space="preserve">        // 7. Place an order, handling any errors gracefully.</w:t>
+      </w:r>
+    </w:p>
+    <w:p>
+      <w:pPr>
+        <w:spacing w:line="240" w:lineRule="auto" w:after="0"/>
+        <w:ind w:left="288"/>
+      </w:pPr>
+      <w:r>
+        <w:rPr>
+          <w:rFonts w:ascii="Courier New" w:hAnsi="Courier New"/>
+          <w:sz w:val="18"/>
+        </w:rPr>
+        <w:t xml:space="preserve">        try {</w:t>
+      </w:r>
+    </w:p>
+    <w:p>
+      <w:pPr>
+        <w:spacing w:line="240" w:lineRule="auto" w:after="0"/>
+        <w:ind w:left="288"/>
+      </w:pPr>
+      <w:r>
+        <w:rPr>
+          <w:rFonts w:ascii="Courier New" w:hAnsi="Courier New"/>
+          <w:sz w:val="18"/>
+        </w:rPr>
+        <w:t xml:space="preserve">            Order order = new Order(5001, customer, customer.getShoppingCart());</w:t>
+      </w:r>
+    </w:p>
+    <w:p>
+      <w:pPr>
+        <w:spacing w:line="240" w:lineRule="auto" w:after="0"/>
+        <w:ind w:left="288"/>
+      </w:pPr>
+      <w:r>
+        <w:rPr>
+          <w:rFonts w:ascii="Courier New" w:hAnsi="Courier New"/>
+          <w:sz w:val="18"/>
+        </w:rPr>
+        <w:t xml:space="preserve">            System.out.println(order.generateOrderSummary());</w:t>
+      </w:r>
+    </w:p>
+    <w:p>
+      <w:pPr>
+        <w:spacing w:line="240" w:lineRule="auto" w:after="0"/>
+        <w:ind w:left="288"/>
+      </w:pPr>
+      <w:r>
+        <w:rPr>
+          <w:rFonts w:ascii="Courier New" w:hAnsi="Courier New"/>
+          <w:sz w:val="18"/>
+        </w:rPr>
+        <w:t xml:space="preserve">            System.out.println();</w:t>
+      </w:r>
+    </w:p>
+    <w:p>
+      <w:pPr>
+        <w:spacing w:line="240" w:lineRule="auto" w:after="0"/>
+        <w:ind w:left="288"/>
+      </w:pPr>
+      <w:r>
+        <w:rPr>
+          <w:rFonts w:ascii="Courier New" w:hAnsi="Courier New"/>
+          <w:sz w:val="18"/>
+        </w:rPr>
+      </w:r>
+    </w:p>
+    <w:p>
+      <w:pPr>
+        <w:spacing w:line="240" w:lineRule="auto" w:after="0"/>
+        <w:ind w:left="288"/>
+      </w:pPr>
+      <w:r>
+        <w:rPr>
+          <w:rFonts w:ascii="Courier New" w:hAnsi="Courier New"/>
+          <w:sz w:val="18"/>
+        </w:rPr>
+        <w:t xml:space="preserve">            // Update the order status through the fulfilment process.</w:t>
+      </w:r>
+    </w:p>
+    <w:p>
+      <w:pPr>
+        <w:spacing w:line="240" w:lineRule="auto" w:after="0"/>
+        <w:ind w:left="288"/>
+      </w:pPr>
+      <w:r>
+        <w:rPr>
+          <w:rFonts w:ascii="Courier New" w:hAnsi="Courier New"/>
+          <w:sz w:val="18"/>
+        </w:rPr>
+        <w:t xml:space="preserve">            order.updateStatus("SHIPPED");</w:t>
+      </w:r>
+    </w:p>
+    <w:p>
+      <w:pPr>
+        <w:spacing w:line="240" w:lineRule="auto" w:after="0"/>
+        <w:ind w:left="288"/>
+      </w:pPr>
+      <w:r>
+        <w:rPr>
+          <w:rFonts w:ascii="Courier New" w:hAnsi="Courier New"/>
+          <w:sz w:val="18"/>
+        </w:rPr>
+        <w:t xml:space="preserve">            System.out.println("Final status of order " + order.getOrderID()</w:t>
+      </w:r>
+    </w:p>
+    <w:p>
+      <w:pPr>
+        <w:spacing w:line="240" w:lineRule="auto" w:after="0"/>
+        <w:ind w:left="288"/>
+      </w:pPr>
+      <w:r>
+        <w:rPr>
+          <w:rFonts w:ascii="Courier New" w:hAnsi="Courier New"/>
+          <w:sz w:val="18"/>
+        </w:rPr>
+        <w:t xml:space="preserve">                    + ": " + order.getStatus());</w:t>
+      </w:r>
+    </w:p>
+    <w:p>
+      <w:pPr>
+        <w:spacing w:line="240" w:lineRule="auto" w:after="0"/>
+        <w:ind w:left="288"/>
+      </w:pPr>
+      <w:r>
+        <w:rPr>
+          <w:rFonts w:ascii="Courier New" w:hAnsi="Courier New"/>
+          <w:sz w:val="18"/>
+        </w:rPr>
+        <w:t xml:space="preserve">        } catch (IllegalArgumentException e) {</w:t>
+      </w:r>
+    </w:p>
+    <w:p>
+      <w:pPr>
+        <w:spacing w:line="240" w:lineRule="auto" w:after="0"/>
+        <w:ind w:left="288"/>
+      </w:pPr>
+      <w:r>
+        <w:rPr>
+          <w:rFonts w:ascii="Courier New" w:hAnsi="Courier New"/>
+          <w:sz w:val="18"/>
+        </w:rPr>
+        <w:t xml:space="preserve">            System.out.println("Could not place order: " + e.getMessage());</w:t>
       </w:r>
     </w:p>
     <w:p>
@@ -5994,32 +6693,32 @@
           <w:rFonts w:ascii="Courier New" w:hAnsi="Courier New"/>
           <w:sz w:val="18"/>
         </w:rPr>
-        <w:t xml:space="preserve">        System.out.printf("Cart total: $%.2f%n%n", customer.calculateTotal());</w:t>
-      </w:r>
-    </w:p>
-    <w:p>
-      <w:pPr>
-        <w:spacing w:line="240" w:lineRule="auto" w:after="0"/>
-        <w:ind w:left="288"/>
-      </w:pPr>
-      <w:r>
-        <w:rPr>
-          <w:rFonts w:ascii="Courier New" w:hAnsi="Courier New"/>
-          <w:sz w:val="18"/>
-        </w:rPr>
-      </w:r>
-    </w:p>
-    <w:p>
-      <w:pPr>
-        <w:spacing w:line="240" w:lineRule="auto" w:after="0"/>
-        <w:ind w:left="288"/>
-      </w:pPr>
-      <w:r>
-        <w:rPr>
-          <w:rFonts w:ascii="Courier New" w:hAnsi="Courier New"/>
-          <w:sz w:val="18"/>
-        </w:rPr>
-        <w:t xml:space="preserve">        // 6. Place an order, handling any errors gracefully.</w:t>
+      </w:r>
+    </w:p>
+    <w:p>
+      <w:pPr>
+        <w:spacing w:line="240" w:lineRule="auto" w:after="0"/>
+        <w:ind w:left="288"/>
+      </w:pPr>
+      <w:r>
+        <w:rPr>
+          <w:rFonts w:ascii="Courier New" w:hAnsi="Courier New"/>
+          <w:sz w:val="18"/>
+        </w:rPr>
+        <w:t xml:space="preserve">        // 8. Demonstrate validation: attempt an order with an empty cart.</w:t>
+      </w:r>
+    </w:p>
+    <w:p>
+      <w:pPr>
+        <w:spacing w:line="240" w:lineRule="auto" w:after="0"/>
+        <w:ind w:left="288"/>
+      </w:pPr>
+      <w:r>
+        <w:rPr>
+          <w:rFonts w:ascii="Courier New" w:hAnsi="Courier New"/>
+          <w:sz w:val="18"/>
+        </w:rPr>
+        <w:t xml:space="preserve">        System.out.println("\n--- Validation demo: ordering with an empty cart ---");</w:t>
       </w:r>
     </w:p>
     <w:p>
@@ -6045,97 +6744,46 @@
           <w:rFonts w:ascii="Courier New" w:hAnsi="Courier New"/>
           <w:sz w:val="18"/>
         </w:rPr>
-        <w:t xml:space="preserve">            Order order = new Order(5001, customer, customer.getShoppingCart());</w:t>
-      </w:r>
-    </w:p>
-    <w:p>
-      <w:pPr>
-        <w:spacing w:line="240" w:lineRule="auto" w:after="0"/>
-        <w:ind w:left="288"/>
-      </w:pPr>
-      <w:r>
-        <w:rPr>
-          <w:rFonts w:ascii="Courier New" w:hAnsi="Courier New"/>
-          <w:sz w:val="18"/>
-        </w:rPr>
-        <w:t xml:space="preserve">            System.out.println(order.generateOrderSummary());</w:t>
-      </w:r>
-    </w:p>
-    <w:p>
-      <w:pPr>
-        <w:spacing w:line="240" w:lineRule="auto" w:after="0"/>
-        <w:ind w:left="288"/>
-      </w:pPr>
-      <w:r>
-        <w:rPr>
-          <w:rFonts w:ascii="Courier New" w:hAnsi="Courier New"/>
-          <w:sz w:val="18"/>
-        </w:rPr>
-        <w:t xml:space="preserve">            System.out.println();</w:t>
-      </w:r>
-    </w:p>
-    <w:p>
-      <w:pPr>
-        <w:spacing w:line="240" w:lineRule="auto" w:after="0"/>
-        <w:ind w:left="288"/>
-      </w:pPr>
-      <w:r>
-        <w:rPr>
-          <w:rFonts w:ascii="Courier New" w:hAnsi="Courier New"/>
-          <w:sz w:val="18"/>
-        </w:rPr>
-      </w:r>
-    </w:p>
-    <w:p>
-      <w:pPr>
-        <w:spacing w:line="240" w:lineRule="auto" w:after="0"/>
-        <w:ind w:left="288"/>
-      </w:pPr>
-      <w:r>
-        <w:rPr>
-          <w:rFonts w:ascii="Courier New" w:hAnsi="Courier New"/>
-          <w:sz w:val="18"/>
-        </w:rPr>
-        <w:t xml:space="preserve">            // Update the order status through the fulfilment process.</w:t>
-      </w:r>
-    </w:p>
-    <w:p>
-      <w:pPr>
-        <w:spacing w:line="240" w:lineRule="auto" w:after="0"/>
-        <w:ind w:left="288"/>
-      </w:pPr>
-      <w:r>
-        <w:rPr>
-          <w:rFonts w:ascii="Courier New" w:hAnsi="Courier New"/>
-          <w:sz w:val="18"/>
-        </w:rPr>
-        <w:t xml:space="preserve">            order.updateStatus("SHIPPED");</w:t>
-      </w:r>
-    </w:p>
-    <w:p>
-      <w:pPr>
-        <w:spacing w:line="240" w:lineRule="auto" w:after="0"/>
-        <w:ind w:left="288"/>
-      </w:pPr>
-      <w:r>
-        <w:rPr>
-          <w:rFonts w:ascii="Courier New" w:hAnsi="Courier New"/>
-          <w:sz w:val="18"/>
-        </w:rPr>
-        <w:t xml:space="preserve">            System.out.println("Final status of order " + order.getOrderID()</w:t>
-      </w:r>
-    </w:p>
-    <w:p>
-      <w:pPr>
-        <w:spacing w:line="240" w:lineRule="auto" w:after="0"/>
-        <w:ind w:left="288"/>
-      </w:pPr>
-      <w:r>
-        <w:rPr>
-          <w:rFonts w:ascii="Courier New" w:hAnsi="Courier New"/>
-          <w:sz w:val="18"/>
-        </w:rPr>
-        <w:t xml:space="preserve">                    + ": " + order.getStatus());</w:t>
+        <w:t xml:space="preserve">            Customer emptyCartCustomer = new Customer(2, "Test User");</w:t>
+      </w:r>
+    </w:p>
+    <w:p>
+      <w:pPr>
+        <w:spacing w:line="240" w:lineRule="auto" w:after="0"/>
+        <w:ind w:left="288"/>
+      </w:pPr>
+      <w:r>
+        <w:rPr>
+          <w:rFonts w:ascii="Courier New" w:hAnsi="Courier New"/>
+          <w:sz w:val="18"/>
+        </w:rPr>
+        <w:t xml:space="preserve">            Order badOrder = new Order(5002, emptyCartCustomer,</w:t>
+      </w:r>
+    </w:p>
+    <w:p>
+      <w:pPr>
+        <w:spacing w:line="240" w:lineRule="auto" w:after="0"/>
+        <w:ind w:left="288"/>
+      </w:pPr>
+      <w:r>
+        <w:rPr>
+          <w:rFonts w:ascii="Courier New" w:hAnsi="Courier New"/>
+          <w:sz w:val="18"/>
+        </w:rPr>
+        <w:t xml:space="preserve">                    emptyCartCustomer.getShoppingCart());</w:t>
+      </w:r>
+    </w:p>
+    <w:p>
+      <w:pPr>
+        <w:spacing w:line="240" w:lineRule="auto" w:after="0"/>
+        <w:ind w:left="288"/>
+      </w:pPr>
+      <w:r>
+        <w:rPr>
+          <w:rFonts w:ascii="Courier New" w:hAnsi="Courier New"/>
+          <w:sz w:val="18"/>
+        </w:rPr>
+        <w:t xml:space="preserve">            System.out.println(badOrder.generateOrderSummary());</w:t>
       </w:r>
     </w:p>
     <w:p>
@@ -6161,7 +6809,7 @@
           <w:rFonts w:ascii="Courier New" w:hAnsi="Courier New"/>
           <w:sz w:val="18"/>
         </w:rPr>
-        <w:t xml:space="preserve">            System.out.println("Could not place order: " + e.getMessage());</w:t>
+        <w:t xml:space="preserve">            System.out.println("Order rejected as expected: " + e.getMessage());</w:t>
       </w:r>
     </w:p>
     <w:p>
@@ -6199,149 +6847,20 @@
           <w:rFonts w:ascii="Courier New" w:hAnsi="Courier New"/>
           <w:sz w:val="18"/>
         </w:rPr>
-        <w:t xml:space="preserve">        // 7. Demonstrate validation: attempt an order with an empty cart.</w:t>
-      </w:r>
-    </w:p>
-    <w:p>
-      <w:pPr>
-        <w:spacing w:line="240" w:lineRule="auto" w:after="0"/>
-        <w:ind w:left="288"/>
-      </w:pPr>
-      <w:r>
-        <w:rPr>
-          <w:rFonts w:ascii="Courier New" w:hAnsi="Courier New"/>
-          <w:sz w:val="18"/>
-        </w:rPr>
-        <w:t xml:space="preserve">        System.out.println("\n--- Validation demo: ordering with an empty cart ---");</w:t>
-      </w:r>
-    </w:p>
-    <w:p>
-      <w:pPr>
-        <w:spacing w:line="240" w:lineRule="auto" w:after="0"/>
-        <w:ind w:left="288"/>
-      </w:pPr>
-      <w:r>
-        <w:rPr>
-          <w:rFonts w:ascii="Courier New" w:hAnsi="Courier New"/>
-          <w:sz w:val="18"/>
-        </w:rPr>
-        <w:t xml:space="preserve">        try {</w:t>
-      </w:r>
-    </w:p>
-    <w:p>
-      <w:pPr>
-        <w:spacing w:line="240" w:lineRule="auto" w:after="0"/>
-        <w:ind w:left="288"/>
-      </w:pPr>
-      <w:r>
-        <w:rPr>
-          <w:rFonts w:ascii="Courier New" w:hAnsi="Courier New"/>
-          <w:sz w:val="18"/>
-        </w:rPr>
-        <w:t xml:space="preserve">            Customer emptyCartCustomer = new Customer(2, "Test User");</w:t>
-      </w:r>
-    </w:p>
-    <w:p>
-      <w:pPr>
-        <w:spacing w:line="240" w:lineRule="auto" w:after="0"/>
-        <w:ind w:left="288"/>
-      </w:pPr>
-      <w:r>
-        <w:rPr>
-          <w:rFonts w:ascii="Courier New" w:hAnsi="Courier New"/>
-          <w:sz w:val="18"/>
-        </w:rPr>
-        <w:t xml:space="preserve">            Order badOrder = new Order(5002, emptyCartCustomer,</w:t>
-      </w:r>
-    </w:p>
-    <w:p>
-      <w:pPr>
-        <w:spacing w:line="240" w:lineRule="auto" w:after="0"/>
-        <w:ind w:left="288"/>
-      </w:pPr>
-      <w:r>
-        <w:rPr>
-          <w:rFonts w:ascii="Courier New" w:hAnsi="Courier New"/>
-          <w:sz w:val="18"/>
-        </w:rPr>
-        <w:t xml:space="preserve">                    emptyCartCustomer.getShoppingCart());</w:t>
-      </w:r>
-    </w:p>
-    <w:p>
-      <w:pPr>
-        <w:spacing w:line="240" w:lineRule="auto" w:after="0"/>
-        <w:ind w:left="288"/>
-      </w:pPr>
-      <w:r>
-        <w:rPr>
-          <w:rFonts w:ascii="Courier New" w:hAnsi="Courier New"/>
-          <w:sz w:val="18"/>
-        </w:rPr>
-        <w:t xml:space="preserve">            System.out.println(badOrder.generateOrderSummary());</w:t>
-      </w:r>
-    </w:p>
-    <w:p>
-      <w:pPr>
-        <w:spacing w:line="240" w:lineRule="auto" w:after="0"/>
-        <w:ind w:left="288"/>
-      </w:pPr>
-      <w:r>
-        <w:rPr>
-          <w:rFonts w:ascii="Courier New" w:hAnsi="Courier New"/>
-          <w:sz w:val="18"/>
-        </w:rPr>
-        <w:t xml:space="preserve">        } catch (IllegalArgumentException e) {</w:t>
-      </w:r>
-    </w:p>
-    <w:p>
-      <w:pPr>
-        <w:spacing w:line="240" w:lineRule="auto" w:after="0"/>
-        <w:ind w:left="288"/>
-      </w:pPr>
-      <w:r>
-        <w:rPr>
-          <w:rFonts w:ascii="Courier New" w:hAnsi="Courier New"/>
-          <w:sz w:val="18"/>
-        </w:rPr>
-        <w:t xml:space="preserve">            System.out.println("Order rejected as expected: " + e.getMessage());</w:t>
-      </w:r>
-    </w:p>
-    <w:p>
-      <w:pPr>
-        <w:spacing w:line="240" w:lineRule="auto" w:after="0"/>
-        <w:ind w:left="288"/>
-      </w:pPr>
-      <w:r>
-        <w:rPr>
-          <w:rFonts w:ascii="Courier New" w:hAnsi="Courier New"/>
-          <w:sz w:val="18"/>
-        </w:rPr>
-        <w:t xml:space="preserve">        }</w:t>
-      </w:r>
-    </w:p>
-    <w:p>
-      <w:pPr>
-        <w:spacing w:line="240" w:lineRule="auto" w:after="0"/>
-        <w:ind w:left="288"/>
-      </w:pPr>
-      <w:r>
-        <w:rPr>
-          <w:rFonts w:ascii="Courier New" w:hAnsi="Courier New"/>
-          <w:sz w:val="18"/>
-        </w:rPr>
-      </w:r>
-    </w:p>
-    <w:p>
-      <w:pPr>
-        <w:spacing w:line="240" w:lineRule="auto" w:after="0"/>
-        <w:ind w:left="288"/>
-      </w:pPr>
-      <w:r>
-        <w:rPr>
-          <w:rFonts w:ascii="Courier New" w:hAnsi="Courier New"/>
-          <w:sz w:val="18"/>
-        </w:rPr>
         <w:t xml:space="preserve">        System.out.println("\n===== Thank you for shopping with us! =====");</w:t>
+      </w:r>
+    </w:p>
+    <w:p>
+      <w:pPr>
+        <w:spacing w:line="240" w:lineRule="auto" w:after="0"/>
+        <w:ind w:left="288"/>
+      </w:pPr>
+      <w:r>
+        <w:rPr>
+          <w:rFonts w:ascii="Courier New" w:hAnsi="Courier New"/>
+          <w:sz w:val="18"/>
+        </w:rPr>
+        <w:t xml:space="preserve">        scanner.close();</w:t>
       </w:r>
     </w:p>
     <w:p>
@@ -6409,7 +6928,7 @@
           <w:b w:val="0"/>
           <w:sz w:val="24"/>
         </w:rPr>
-        <w:t>The program was compiled with javac -Xlint:all (no errors or warnings) and produced the following output. The cart total of $65.49 equals $15.99 + $49.50 after the USB-C Cable was removed, and the empty-cart order is correctly rejected by input validation.</w:t>
+        <w:t>The program was compiled with javac -Xlint:all (no errors or warnings) and produced the following output. It validates the user's menu input: the non-numeric entry "abc" and the out-of-range entry "9" are both rejected before the valid entry "4" is accepted. The final cart total of $92.49 equals $15.99 + $49.50 + $27.00, and the empty-cart order is correctly rejected by validation.</w:t>
       </w:r>
     </w:p>
     <w:p>
@@ -6460,6 +6979,262 @@
           <w:rFonts w:ascii="Courier New" w:hAnsi="Courier New"/>
           <w:sz w:val="18"/>
         </w:rPr>
+        <w:t xml:space="preserve">  1. [ID 101] Wireless Mouse - $15.99</w:t>
+      </w:r>
+    </w:p>
+    <w:p>
+      <w:pPr>
+        <w:spacing w:line="240" w:lineRule="auto" w:after="0"/>
+        <w:ind w:left="288"/>
+      </w:pPr>
+      <w:r>
+        <w:rPr>
+          <w:rFonts w:ascii="Courier New" w:hAnsi="Courier New"/>
+          <w:sz w:val="18"/>
+        </w:rPr>
+        <w:t xml:space="preserve">  2. [ID 102] Mechanical Keyboard - $49.50</w:t>
+      </w:r>
+    </w:p>
+    <w:p>
+      <w:pPr>
+        <w:spacing w:line="240" w:lineRule="auto" w:after="0"/>
+        <w:ind w:left="288"/>
+      </w:pPr>
+      <w:r>
+        <w:rPr>
+          <w:rFonts w:ascii="Courier New" w:hAnsi="Courier New"/>
+          <w:sz w:val="18"/>
+        </w:rPr>
+        <w:t xml:space="preserve">  3. [ID 103] USB-C Cable - $8.75</w:t>
+      </w:r>
+    </w:p>
+    <w:p>
+      <w:pPr>
+        <w:spacing w:line="240" w:lineRule="auto" w:after="0"/>
+        <w:ind w:left="288"/>
+      </w:pPr>
+      <w:r>
+        <w:rPr>
+          <w:rFonts w:ascii="Courier New" w:hAnsi="Courier New"/>
+          <w:sz w:val="18"/>
+        </w:rPr>
+        <w:t xml:space="preserve">  4. [ID 104] Laptop Stand - $27.00</w:t>
+      </w:r>
+    </w:p>
+    <w:p>
+      <w:pPr>
+        <w:spacing w:line="240" w:lineRule="auto" w:after="0"/>
+        <w:ind w:left="288"/>
+      </w:pPr>
+      <w:r>
+        <w:rPr>
+          <w:rFonts w:ascii="Courier New" w:hAnsi="Courier New"/>
+          <w:sz w:val="18"/>
+        </w:rPr>
+      </w:r>
+    </w:p>
+    <w:p>
+      <w:pPr>
+        <w:spacing w:line="240" w:lineRule="auto" w:after="0"/>
+        <w:ind w:left="288"/>
+      </w:pPr>
+      <w:r>
+        <w:rPr>
+          <w:rFonts w:ascii="Courier New" w:hAnsi="Courier New"/>
+          <w:sz w:val="18"/>
+        </w:rPr>
+        <w:t>Customer [ID 1]: Nicanor</w:t>
+      </w:r>
+    </w:p>
+    <w:p>
+      <w:pPr>
+        <w:spacing w:line="240" w:lineRule="auto" w:after="0"/>
+        <w:ind w:left="288"/>
+      </w:pPr>
+      <w:r>
+        <w:rPr>
+          <w:rFonts w:ascii="Courier New" w:hAnsi="Courier New"/>
+          <w:sz w:val="18"/>
+        </w:rPr>
+      </w:r>
+    </w:p>
+    <w:p>
+      <w:pPr>
+        <w:spacing w:line="240" w:lineRule="auto" w:after="0"/>
+        <w:ind w:left="288"/>
+      </w:pPr>
+      <w:r>
+        <w:rPr>
+          <w:rFonts w:ascii="Courier New" w:hAnsi="Courier New"/>
+          <w:sz w:val="18"/>
+        </w:rPr>
+        <w:t>Nicanor added Wireless Mouse to the cart.</w:t>
+      </w:r>
+    </w:p>
+    <w:p>
+      <w:pPr>
+        <w:spacing w:line="240" w:lineRule="auto" w:after="0"/>
+        <w:ind w:left="288"/>
+      </w:pPr>
+      <w:r>
+        <w:rPr>
+          <w:rFonts w:ascii="Courier New" w:hAnsi="Courier New"/>
+          <w:sz w:val="18"/>
+        </w:rPr>
+        <w:t>Nicanor added Mechanical Keyboard to the cart.</w:t>
+      </w:r>
+    </w:p>
+    <w:p>
+      <w:pPr>
+        <w:spacing w:line="240" w:lineRule="auto" w:after="0"/>
+        <w:ind w:left="288"/>
+      </w:pPr>
+      <w:r>
+        <w:rPr>
+          <w:rFonts w:ascii="Courier New" w:hAnsi="Courier New"/>
+          <w:sz w:val="18"/>
+        </w:rPr>
+        <w:t>Nicanor added USB-C Cable to the cart.</w:t>
+      </w:r>
+    </w:p>
+    <w:p>
+      <w:pPr>
+        <w:spacing w:line="240" w:lineRule="auto" w:after="0"/>
+        <w:ind w:left="288"/>
+      </w:pPr>
+      <w:r>
+        <w:rPr>
+          <w:rFonts w:ascii="Courier New" w:hAnsi="Courier New"/>
+          <w:sz w:val="18"/>
+        </w:rPr>
+        <w:t>Nicanor removed USB-C Cable from the cart.</w:t>
+      </w:r>
+    </w:p>
+    <w:p>
+      <w:pPr>
+        <w:spacing w:line="240" w:lineRule="auto" w:after="0"/>
+        <w:ind w:left="288"/>
+      </w:pPr>
+      <w:r>
+        <w:rPr>
+          <w:rFonts w:ascii="Courier New" w:hAnsi="Courier New"/>
+          <w:sz w:val="18"/>
+        </w:rPr>
+      </w:r>
+    </w:p>
+    <w:p>
+      <w:pPr>
+        <w:spacing w:line="240" w:lineRule="auto" w:after="0"/>
+        <w:ind w:left="288"/>
+      </w:pPr>
+      <w:r>
+        <w:rPr>
+          <w:rFonts w:ascii="Courier New" w:hAnsi="Courier New"/>
+          <w:sz w:val="18"/>
+        </w:rPr>
+        <w:t>Enter the number (1-4) of another product to add: abc</w:t>
+      </w:r>
+    </w:p>
+    <w:p>
+      <w:pPr>
+        <w:spacing w:line="240" w:lineRule="auto" w:after="0"/>
+        <w:ind w:left="288"/>
+      </w:pPr>
+      <w:r>
+        <w:rPr>
+          <w:rFonts w:ascii="Courier New" w:hAnsi="Courier New"/>
+          <w:sz w:val="18"/>
+        </w:rPr>
+        <w:t>Invalid input: please enter a whole number.</w:t>
+      </w:r>
+    </w:p>
+    <w:p>
+      <w:pPr>
+        <w:spacing w:line="240" w:lineRule="auto" w:after="0"/>
+        <w:ind w:left="288"/>
+      </w:pPr>
+      <w:r>
+        <w:rPr>
+          <w:rFonts w:ascii="Courier New" w:hAnsi="Courier New"/>
+          <w:sz w:val="18"/>
+        </w:rPr>
+        <w:t>Enter the number (1-4) of another product to add: 9</w:t>
+      </w:r>
+    </w:p>
+    <w:p>
+      <w:pPr>
+        <w:spacing w:line="240" w:lineRule="auto" w:after="0"/>
+        <w:ind w:left="288"/>
+      </w:pPr>
+      <w:r>
+        <w:rPr>
+          <w:rFonts w:ascii="Courier New" w:hAnsi="Courier New"/>
+          <w:sz w:val="18"/>
+        </w:rPr>
+        <w:t>Please enter a number between 1 and 4.</w:t>
+      </w:r>
+    </w:p>
+    <w:p>
+      <w:pPr>
+        <w:spacing w:line="240" w:lineRule="auto" w:after="0"/>
+        <w:ind w:left="288"/>
+      </w:pPr>
+      <w:r>
+        <w:rPr>
+          <w:rFonts w:ascii="Courier New" w:hAnsi="Courier New"/>
+          <w:sz w:val="18"/>
+        </w:rPr>
+        <w:t>Enter the number (1-4) of another product to add: 4</w:t>
+      </w:r>
+    </w:p>
+    <w:p>
+      <w:pPr>
+        <w:spacing w:line="240" w:lineRule="auto" w:after="0"/>
+        <w:ind w:left="288"/>
+      </w:pPr>
+      <w:r>
+        <w:rPr>
+          <w:rFonts w:ascii="Courier New" w:hAnsi="Courier New"/>
+          <w:sz w:val="18"/>
+        </w:rPr>
+        <w:t>Nicanor added Laptop Stand to the cart.</w:t>
+      </w:r>
+    </w:p>
+    <w:p>
+      <w:pPr>
+        <w:spacing w:line="240" w:lineRule="auto" w:after="0"/>
+        <w:ind w:left="288"/>
+      </w:pPr>
+      <w:r>
+        <w:rPr>
+          <w:rFonts w:ascii="Courier New" w:hAnsi="Courier New"/>
+          <w:sz w:val="18"/>
+        </w:rPr>
+      </w:r>
+    </w:p>
+    <w:p>
+      <w:pPr>
+        <w:spacing w:line="240" w:lineRule="auto" w:after="0"/>
+        <w:ind w:left="288"/>
+      </w:pPr>
+      <w:r>
+        <w:rPr>
+          <w:rFonts w:ascii="Courier New" w:hAnsi="Courier New"/>
+          <w:sz w:val="18"/>
+        </w:rPr>
+        <w:t>Current cart for Nicanor:</w:t>
+      </w:r>
+    </w:p>
+    <w:p>
+      <w:pPr>
+        <w:spacing w:line="240" w:lineRule="auto" w:after="0"/>
+        <w:ind w:left="288"/>
+      </w:pPr>
+      <w:r>
+        <w:rPr>
+          <w:rFonts w:ascii="Courier New" w:hAnsi="Courier New"/>
+          <w:sz w:val="18"/>
+        </w:rPr>
         <w:t xml:space="preserve">  [ID 101] Wireless Mouse - $15.99</w:t>
       </w:r>
     </w:p>
@@ -6486,19 +7261,6 @@
           <w:rFonts w:ascii="Courier New" w:hAnsi="Courier New"/>
           <w:sz w:val="18"/>
         </w:rPr>
-        <w:t xml:space="preserve">  [ID 103] USB-C Cable - $8.75</w:t>
-      </w:r>
-    </w:p>
-    <w:p>
-      <w:pPr>
-        <w:spacing w:line="240" w:lineRule="auto" w:after="0"/>
-        <w:ind w:left="288"/>
-      </w:pPr>
-      <w:r>
-        <w:rPr>
-          <w:rFonts w:ascii="Courier New" w:hAnsi="Courier New"/>
-          <w:sz w:val="18"/>
-        </w:rPr>
         <w:t xml:space="preserve">  [ID 104] Laptop Stand - $27.00</w:t>
       </w:r>
     </w:p>
@@ -6512,6 +7274,45 @@
           <w:rFonts w:ascii="Courier New" w:hAnsi="Courier New"/>
           <w:sz w:val="18"/>
         </w:rPr>
+        <w:t>Cart total: $92.49</w:t>
+      </w:r>
+    </w:p>
+    <w:p>
+      <w:pPr>
+        <w:spacing w:line="240" w:lineRule="auto" w:after="0"/>
+        <w:ind w:left="288"/>
+      </w:pPr>
+      <w:r>
+        <w:rPr>
+          <w:rFonts w:ascii="Courier New" w:hAnsi="Courier New"/>
+          <w:sz w:val="18"/>
+        </w:rPr>
+      </w:r>
+    </w:p>
+    <w:p>
+      <w:pPr>
+        <w:spacing w:line="240" w:lineRule="auto" w:after="0"/>
+        <w:ind w:left="288"/>
+      </w:pPr>
+      <w:r>
+        <w:rPr>
+          <w:rFonts w:ascii="Courier New" w:hAnsi="Courier New"/>
+          <w:sz w:val="18"/>
+        </w:rPr>
+        <w:t>===== Order Summary =====</w:t>
+      </w:r>
+    </w:p>
+    <w:p>
+      <w:pPr>
+        <w:spacing w:line="240" w:lineRule="auto" w:after="0"/>
+        <w:ind w:left="288"/>
+      </w:pPr>
+      <w:r>
+        <w:rPr>
+          <w:rFonts w:ascii="Courier New" w:hAnsi="Courier New"/>
+          <w:sz w:val="18"/>
+        </w:rPr>
+        <w:t>Order ID: 5001</w:t>
       </w:r>
     </w:p>
     <w:p>
@@ -6537,185 +7338,6 @@
           <w:rFonts w:ascii="Courier New" w:hAnsi="Courier New"/>
           <w:sz w:val="18"/>
         </w:rPr>
-      </w:r>
-    </w:p>
-    <w:p>
-      <w:pPr>
-        <w:spacing w:line="240" w:lineRule="auto" w:after="0"/>
-        <w:ind w:left="288"/>
-      </w:pPr>
-      <w:r>
-        <w:rPr>
-          <w:rFonts w:ascii="Courier New" w:hAnsi="Courier New"/>
-          <w:sz w:val="18"/>
-        </w:rPr>
-        <w:t>Nicanor added Wireless Mouse to the cart.</w:t>
-      </w:r>
-    </w:p>
-    <w:p>
-      <w:pPr>
-        <w:spacing w:line="240" w:lineRule="auto" w:after="0"/>
-        <w:ind w:left="288"/>
-      </w:pPr>
-      <w:r>
-        <w:rPr>
-          <w:rFonts w:ascii="Courier New" w:hAnsi="Courier New"/>
-          <w:sz w:val="18"/>
-        </w:rPr>
-        <w:t>Nicanor added Mechanical Keyboard to the cart.</w:t>
-      </w:r>
-    </w:p>
-    <w:p>
-      <w:pPr>
-        <w:spacing w:line="240" w:lineRule="auto" w:after="0"/>
-        <w:ind w:left="288"/>
-      </w:pPr>
-      <w:r>
-        <w:rPr>
-          <w:rFonts w:ascii="Courier New" w:hAnsi="Courier New"/>
-          <w:sz w:val="18"/>
-        </w:rPr>
-        <w:t>Nicanor added USB-C Cable to the cart.</w:t>
-      </w:r>
-    </w:p>
-    <w:p>
-      <w:pPr>
-        <w:spacing w:line="240" w:lineRule="auto" w:after="0"/>
-        <w:ind w:left="288"/>
-      </w:pPr>
-      <w:r>
-        <w:rPr>
-          <w:rFonts w:ascii="Courier New" w:hAnsi="Courier New"/>
-          <w:sz w:val="18"/>
-        </w:rPr>
-        <w:t>Nicanor removed USB-C Cable from the cart.</w:t>
-      </w:r>
-    </w:p>
-    <w:p>
-      <w:pPr>
-        <w:spacing w:line="240" w:lineRule="auto" w:after="0"/>
-        <w:ind w:left="288"/>
-      </w:pPr>
-      <w:r>
-        <w:rPr>
-          <w:rFonts w:ascii="Courier New" w:hAnsi="Courier New"/>
-          <w:sz w:val="18"/>
-        </w:rPr>
-      </w:r>
-    </w:p>
-    <w:p>
-      <w:pPr>
-        <w:spacing w:line="240" w:lineRule="auto" w:after="0"/>
-        <w:ind w:left="288"/>
-      </w:pPr>
-      <w:r>
-        <w:rPr>
-          <w:rFonts w:ascii="Courier New" w:hAnsi="Courier New"/>
-          <w:sz w:val="18"/>
-        </w:rPr>
-        <w:t>Current cart for Nicanor:</w:t>
-      </w:r>
-    </w:p>
-    <w:p>
-      <w:pPr>
-        <w:spacing w:line="240" w:lineRule="auto" w:after="0"/>
-        <w:ind w:left="288"/>
-      </w:pPr>
-      <w:r>
-        <w:rPr>
-          <w:rFonts w:ascii="Courier New" w:hAnsi="Courier New"/>
-          <w:sz w:val="18"/>
-        </w:rPr>
-        <w:t xml:space="preserve">  [ID 101] Wireless Mouse - $15.99</w:t>
-      </w:r>
-    </w:p>
-    <w:p>
-      <w:pPr>
-        <w:spacing w:line="240" w:lineRule="auto" w:after="0"/>
-        <w:ind w:left="288"/>
-      </w:pPr>
-      <w:r>
-        <w:rPr>
-          <w:rFonts w:ascii="Courier New" w:hAnsi="Courier New"/>
-          <w:sz w:val="18"/>
-        </w:rPr>
-        <w:t xml:space="preserve">  [ID 102] Mechanical Keyboard - $49.50</w:t>
-      </w:r>
-    </w:p>
-    <w:p>
-      <w:pPr>
-        <w:spacing w:line="240" w:lineRule="auto" w:after="0"/>
-        <w:ind w:left="288"/>
-      </w:pPr>
-      <w:r>
-        <w:rPr>
-          <w:rFonts w:ascii="Courier New" w:hAnsi="Courier New"/>
-          <w:sz w:val="18"/>
-        </w:rPr>
-        <w:t>Cart total: $65.49</w:t>
-      </w:r>
-    </w:p>
-    <w:p>
-      <w:pPr>
-        <w:spacing w:line="240" w:lineRule="auto" w:after="0"/>
-        <w:ind w:left="288"/>
-      </w:pPr>
-      <w:r>
-        <w:rPr>
-          <w:rFonts w:ascii="Courier New" w:hAnsi="Courier New"/>
-          <w:sz w:val="18"/>
-        </w:rPr>
-      </w:r>
-    </w:p>
-    <w:p>
-      <w:pPr>
-        <w:spacing w:line="240" w:lineRule="auto" w:after="0"/>
-        <w:ind w:left="288"/>
-      </w:pPr>
-      <w:r>
-        <w:rPr>
-          <w:rFonts w:ascii="Courier New" w:hAnsi="Courier New"/>
-          <w:sz w:val="18"/>
-        </w:rPr>
-        <w:t>===== Order Summary =====</w:t>
-      </w:r>
-    </w:p>
-    <w:p>
-      <w:pPr>
-        <w:spacing w:line="240" w:lineRule="auto" w:after="0"/>
-        <w:ind w:left="288"/>
-      </w:pPr>
-      <w:r>
-        <w:rPr>
-          <w:rFonts w:ascii="Courier New" w:hAnsi="Courier New"/>
-          <w:sz w:val="18"/>
-        </w:rPr>
-        <w:t>Order ID: 5001</w:t>
-      </w:r>
-    </w:p>
-    <w:p>
-      <w:pPr>
-        <w:spacing w:line="240" w:lineRule="auto" w:after="0"/>
-        <w:ind w:left="288"/>
-      </w:pPr>
-      <w:r>
-        <w:rPr>
-          <w:rFonts w:ascii="Courier New" w:hAnsi="Courier New"/>
-          <w:sz w:val="18"/>
-        </w:rPr>
-        <w:t>Customer [ID 1]: Nicanor</w:t>
-      </w:r>
-    </w:p>
-    <w:p>
-      <w:pPr>
-        <w:spacing w:line="240" w:lineRule="auto" w:after="0"/>
-        <w:ind w:left="288"/>
-      </w:pPr>
-      <w:r>
-        <w:rPr>
-          <w:rFonts w:ascii="Courier New" w:hAnsi="Courier New"/>
-          <w:sz w:val="18"/>
-        </w:rPr>
         <w:t>Products:</w:t>
       </w:r>
     </w:p>
@@ -6755,7 +7377,20 @@
           <w:rFonts w:ascii="Courier New" w:hAnsi="Courier New"/>
           <w:sz w:val="18"/>
         </w:rPr>
-        <w:t>Order Total: $65.49</w:t>
+        <w:t xml:space="preserve">  - [ID 104] Laptop Stand - $27.00</w:t>
+      </w:r>
+    </w:p>
+    <w:p>
+      <w:pPr>
+        <w:spacing w:line="240" w:lineRule="auto" w:after="0"/>
+        <w:ind w:left="288"/>
+      </w:pPr>
+      <w:r>
+        <w:rPr>
+          <w:rFonts w:ascii="Courier New" w:hAnsi="Courier New"/>
+          <w:sz w:val="18"/>
+        </w:rPr>
+        <w:t>Order Total: $92.49</w:t>
       </w:r>
     </w:p>
     <w:p>

</xml_diff>

<commit_message>
CS1103 Unit 2: add APA in-text citations + academic integrity statement
- Add in-text citations (Eck, 2022; Samoylov, 2018) in the overview so
  the listed references are actually cited (consistent APA)
- Add an academic integrity statement affirming original work
- Sync .md and .docx
</commit_message>
<xml_diff>
--- a/CS1103_Programming_2/Unit2_Packages/Assignment/Unit2_Programming_Assignment.docx
+++ b/CS1103_Programming_2/Unit2_Packages/Assignment/Unit2_Programming_Assignment.docx
@@ -205,7 +205,7 @@
           <w:b w:val="0"/>
           <w:sz w:val="24"/>
         </w:rPr>
-        <w:t>This program implements a simple e-commerce system in Java, organized with packages for clean encapsulation. Products and customers live in the com.ecommerce package, and orders live in the com.ecommerce.orders package, which imports the Product and Customer classes to show cross-package use of the import statement. A separate Main class (outside the packages) imports all three classes and demonstrates the full workflow: browsing a product catalog, adding and removing items from a shopping cart, calculating the cart total, placing an order, generating an order summary, and updating the order status. All fields are private with getters and setters for encapsulation, and constructors validate their inputs so invalid data is rejected.</w:t>
+        <w:t>This program implements a simple e-commerce system in Java, organized with packages for clean encapsulation. A package groups related classes into a single namespace, which avoids naming conflicts and keeps larger programs organized (Eck, 2022). Products and customers live in the com.ecommerce package, and orders live in the com.ecommerce.orders package, which imports the Product and Customer classes to show cross-package use of the import statement; the import statement lets one package use the public classes of another (Samoylov, 2018). A separate Main class (outside the packages) imports all three classes and demonstrates the full workflow: browsing a product catalog, adding and removing items from a shopping cart, calculating the cart total, placing an order, generating an order summary, and updating the order status. All fields are declared private with public getters and setters, which enforces encapsulation and data hiding (Eck, 2022), and the constructors validate their inputs so invalid data is rejected.</w:t>
       </w:r>
     </w:p>
     <w:p>
@@ -7615,6 +7615,35 @@
           <w:sz w:val="24"/>
         </w:rPr>
         <w:t>[ Insert Screenshot 2 here ]</w:t>
+      </w:r>
+    </w:p>
+    <w:p>
+      <w:pPr>
+        <w:pStyle w:val="Heading2"/>
+        <w:spacing w:line="360" w:lineRule="auto"/>
+      </w:pPr>
+      <w:r>
+        <w:rPr>
+          <w:rFonts w:ascii="Times New Roman" w:hAnsi="Times New Roman"/>
+          <w:b/>
+          <w:color w:val="000000"/>
+          <w:sz w:val="24"/>
+        </w:rPr>
+        <w:t>Academic Integrity Statement</w:t>
+      </w:r>
+    </w:p>
+    <w:p>
+      <w:pPr>
+        <w:spacing w:line="360" w:lineRule="auto" w:after="200"/>
+        <w:ind w:firstLine="0"/>
+      </w:pPr>
+      <w:r>
+        <w:rPr>
+          <w:rFonts w:ascii="Times New Roman" w:hAnsi="Times New Roman"/>
+          <w:b w:val="0"/>
+          <w:sz w:val="24"/>
+        </w:rPr>
+        <w:t>This assignment is my own original work. I designed and wrote all of the Java source code and the accompanying explanations myself for this task. Ideas drawn from the course readings are cited in APA style, and the sources are listed in the References section below.</w:t>
       </w:r>
     </w:p>
     <w:p>

</xml_diff>